<commit_message>
docs: finalize report with revision identifiers
</commit_message>
<xml_diff>
--- a/tests/FarmConnect_Test_Report.docx
+++ b/tests/FarmConnect_Test_Report.docx
@@ -87,7 +87,11 @@
         <w:pStyle w:val="ListBullet"/>
       </w:pPr>
       <w:r>
-        <w:t>Final implementation commit IDs: see the delivery message accompanying this report; commits are made separately in the frontend and backend forks.</w:t>
+        <w:t>Final frontend implementation commit: 24d847f3a8d4c73a0c3b83f467c727a45b54c406 on https://github.com/aparoolive9-blip/farmconnect-frontend/tree/feature/favorites.</w:t>
+        <w:br/>
+        <w:t>Final backend feature implementation commit: 133f400 on https://github.com/aparoolive9-blip/farmconnect-backend/tree/feature/favorites.</w:t>
+        <w:br/>
+        <w:t>Backend setup, test, and evidence package commit: 8bd406e.</w:t>
       </w:r>
     </w:p>
     <w:p>

</xml_diff>

<commit_message>
docs: record product image verification
</commit_message>
<xml_diff>
--- a/tests/FarmConnect_Test_Report.docx
+++ b/tests/FarmConnect_Test_Report.docx
@@ -87,7 +87,7 @@
         <w:pStyle w:val="ListBullet"/>
       </w:pPr>
       <w:r>
-        <w:t>Final frontend implementation commit: 24d847f3a8d4c73a0c3b83f467c727a45b54c406 on https://github.com/aparoolive9-blip/farmconnect-frontend/tree/feature/favorites.</w:t>
+        <w:t>Final frontend implementation commit: 8708dde on https://github.com/aparoolive9-blip/farmconnect-frontend/tree/feature/favorites.</w:t>
         <w:br/>
         <w:t>Final backend feature implementation commit: 133f400 on https://github.com/aparoolive9-blip/farmconnect-backend/tree/feature/favorites.</w:t>
         <w:br/>
@@ -2562,6 +2562,48 @@
           </w:p>
         </w:tc>
       </w:tr>
+      <w:tr>
+        <w:tc>
+          <w:tcPr>
+            <w:tcW w:type="dxa" w:w="3564"/>
+          </w:tcPr>
+          <w:p>
+            <w:r>
+              <w:t>Browse all seeded products and inspect fallback image sources.</w:t>
+            </w:r>
+          </w:p>
+        </w:tc>
+        <w:tc>
+          <w:tcPr>
+            <w:tcW w:type="dxa" w:w="3564"/>
+          </w:tcPr>
+          <w:p>
+            <w:r>
+              <w:t>Every product shows a photo of the listed item on both cards and details.</w:t>
+            </w:r>
+          </w:p>
+        </w:tc>
+        <w:tc>
+          <w:tcPr>
+            <w:tcW w:type="dxa" w:w="3564"/>
+          </w:tcPr>
+          <w:p>
+            <w:r>
+              <w:t>All 10 seeded products mapped to item-appropriate local images; all loaded. Product 3 detail also used the tomatoes photo.</w:t>
+            </w:r>
+          </w:p>
+        </w:tc>
+        <w:tc>
+          <w:tcPr>
+            <w:tcW w:type="dxa" w:w="3564"/>
+          </w:tcPr>
+          <w:p>
+            <w:r>
+              <w:t>PASS</w:t>
+            </w:r>
+          </w:p>
+        </w:tc>
+      </w:tr>
     </w:tbl>
     <w:p>
       <w:pPr>

</xml_diff>